<commit_message>
Started main page layout
Made a grid, Change background color, started code for image introduction
</commit_message>
<xml_diff>
--- a/Stijlgids/Stijlgids NodeHub.docx
+++ b/Stijlgids/Stijlgids NodeHub.docx
@@ -392,7 +392,6 @@
         </w:rPr>
         <w:t>#00FF00</w:t>
       </w:r>
-      <w:proofErr w:type="gramStart"/>
       <w:r>
         <w:rPr>
           <w:rFonts w:ascii="Biome" w:hAnsi="Biome" w:cs="Biome"/>
@@ -423,7 +422,6 @@
         </w:rPr>
         <w:tab/>
       </w:r>
-      <w:proofErr w:type="gramEnd"/>
       <w:r>
         <w:rPr>
           <w:rFonts w:ascii="Biome" w:hAnsi="Biome" w:cs="Biome"/>
@@ -914,249 +912,241 @@
           <w:color w:val="3A3A3A" w:themeColor="background2" w:themeShade="40"/>
           <w:lang w:val="en-US"/>
         </w:rPr>
-        <w:t xml:space="preserve">Pure </w:t>
-      </w:r>
-      <w:proofErr w:type="gramStart"/>
+        <w:t>Pure black: #000000</w:t>
+      </w:r>
       <w:r>
         <w:rPr>
           <w:rFonts w:ascii="Biome" w:hAnsi="Biome" w:cs="Biome"/>
           <w:color w:val="3A3A3A" w:themeColor="background2" w:themeShade="40"/>
           <w:lang w:val="en-US"/>
         </w:rPr>
-        <w:t xml:space="preserve">black: </w:t>
-      </w:r>
-      <w:r>
-        <w:rPr>
-          <w:rFonts w:ascii="Biome" w:hAnsi="Biome" w:cs="Biome"/>
-          <w:color w:val="3A3A3A" w:themeColor="background2" w:themeShade="40"/>
+        <w:br/>
+      </w:r>
+      <w:r>
+        <w:rPr>
+          <w:rFonts w:ascii="Biome" w:hAnsi="Biome" w:cs="Biome"/>
+          <w:color w:val="1A2B23"/>
+        </w:rPr>
+        <w:t>Will be used for Text.</w:t>
+      </w:r>
+    </w:p>
+    <w:p>
+      <w:pPr>
+        <w:rPr>
+          <w:rFonts w:ascii="Biome" w:hAnsi="Biome" w:cs="Biome"/>
+          <w:color w:val="1A2B23"/>
+        </w:rPr>
+      </w:pPr>
+    </w:p>
+    <w:p>
+      <w:pPr>
+        <w:rPr>
+          <w:rFonts w:ascii="Biome" w:hAnsi="Biome" w:cs="Biome"/>
+          <w:color w:val="3A3A3A" w:themeColor="background2" w:themeShade="40"/>
+        </w:rPr>
+      </w:pPr>
+      <w:r>
+        <w:rPr>
+          <w:rFonts w:ascii="Biome" w:hAnsi="Biome" w:cs="Biome"/>
+          <w:color w:val="1A2B23"/>
+        </w:rPr>
+        <w:t xml:space="preserve">Neon Green: </w:t>
+      </w:r>
+      <w:r>
+        <w:rPr>
+          <w:rFonts w:ascii="Biome" w:hAnsi="Biome" w:cs="Biome"/>
+          <w:color w:val="3A3A3A" w:themeColor="background2" w:themeShade="40"/>
+        </w:rPr>
+        <w:t>#00FF00</w:t>
+      </w:r>
+    </w:p>
+    <w:p>
+      <w:pPr>
+        <w:rPr>
+          <w:rFonts w:ascii="Biome" w:hAnsi="Biome" w:cs="Biome"/>
+          <w:color w:val="3A3A3A" w:themeColor="background2" w:themeShade="40"/>
+        </w:rPr>
+      </w:pPr>
+      <w:r>
+        <w:rPr>
+          <w:rFonts w:ascii="Biome" w:hAnsi="Biome" w:cs="Biome"/>
+          <w:color w:val="3A3A3A" w:themeColor="background2" w:themeShade="40"/>
+        </w:rPr>
+        <w:t>Will be used for the logo, Borders, and buttons</w:t>
+      </w:r>
+    </w:p>
+    <w:p>
+      <w:pPr>
+        <w:rPr>
+          <w:rFonts w:ascii="Biome" w:hAnsi="Biome" w:cs="Biome"/>
+          <w:color w:val="3A3A3A" w:themeColor="background2" w:themeShade="40"/>
+        </w:rPr>
+      </w:pPr>
+      <w:r>
+        <w:rPr>
+          <w:rFonts w:ascii="Biome" w:hAnsi="Biome" w:cs="Biome"/>
+          <w:color w:val="3A3A3A" w:themeColor="background2" w:themeShade="40"/>
+        </w:rPr>
+        <w:t xml:space="preserve"> </w:t>
+      </w:r>
+    </w:p>
+    <w:p>
+      <w:pPr>
+        <w:rPr>
+          <w:rFonts w:ascii="Biome" w:hAnsi="Biome" w:cs="Biome"/>
+          <w:color w:val="3A3A3A" w:themeColor="background2" w:themeShade="40"/>
+          <w:sz w:val="22"/>
+          <w:szCs w:val="22"/>
+        </w:rPr>
+      </w:pPr>
+      <w:r>
+        <w:rPr>
+          <w:rFonts w:ascii="Biome" w:hAnsi="Biome" w:cs="Biome"/>
+          <w:color w:val="3A3A3A" w:themeColor="background2" w:themeShade="40"/>
+        </w:rPr>
+        <w:t xml:space="preserve">Near black: </w:t>
+      </w:r>
+      <w:r>
+        <w:rPr>
+          <w:rFonts w:ascii="Biome" w:hAnsi="Biome" w:cs="Biome"/>
+          <w:color w:val="3A3A3A" w:themeColor="background2" w:themeShade="40"/>
+          <w:sz w:val="22"/>
+          <w:szCs w:val="22"/>
+        </w:rPr>
+        <w:t>#1E2520</w:t>
+      </w:r>
+    </w:p>
+    <w:p>
+      <w:pPr>
+        <w:rPr>
+          <w:rFonts w:ascii="Biome" w:hAnsi="Biome" w:cs="Biome"/>
+          <w:color w:val="3A3A3A" w:themeColor="background2" w:themeShade="40"/>
+          <w:sz w:val="22"/>
+          <w:szCs w:val="22"/>
+        </w:rPr>
+      </w:pPr>
+      <w:r>
+        <w:rPr>
+          <w:rFonts w:ascii="Biome" w:hAnsi="Biome" w:cs="Biome"/>
+          <w:color w:val="3A3A3A" w:themeColor="background2" w:themeShade="40"/>
+          <w:sz w:val="22"/>
+          <w:szCs w:val="22"/>
+        </w:rPr>
+        <w:t xml:space="preserve">Will be the primary </w:t>
+      </w:r>
+      <w:r>
+        <w:rPr>
+          <w:rFonts w:ascii="Biome" w:hAnsi="Biome" w:cs="Biome"/>
+          <w:color w:val="3A3A3A" w:themeColor="background2" w:themeShade="40"/>
+          <w:sz w:val="22"/>
+          <w:szCs w:val="22"/>
+        </w:rPr>
+        <w:t>Banner</w:t>
+      </w:r>
+      <w:r>
+        <w:rPr>
+          <w:rFonts w:ascii="Biome" w:hAnsi="Biome" w:cs="Biome"/>
+          <w:color w:val="3A3A3A" w:themeColor="background2" w:themeShade="40"/>
+          <w:sz w:val="22"/>
+          <w:szCs w:val="22"/>
+        </w:rPr>
+        <w:t xml:space="preserve"> color.</w:t>
+      </w:r>
+    </w:p>
+    <w:p>
+      <w:pPr>
+        <w:rPr>
+          <w:rFonts w:ascii="Biome" w:hAnsi="Biome" w:cs="Biome"/>
+          <w:color w:val="3A3A3A" w:themeColor="background2" w:themeShade="40"/>
+          <w:sz w:val="22"/>
+          <w:szCs w:val="22"/>
+        </w:rPr>
+      </w:pPr>
+    </w:p>
+    <w:p>
+      <w:pPr>
+        <w:rPr>
+          <w:rFonts w:ascii="Biome" w:hAnsi="Biome" w:cs="Biome"/>
+          <w:color w:val="3A3A3A" w:themeColor="background2" w:themeShade="40"/>
+          <w:sz w:val="22"/>
+          <w:szCs w:val="22"/>
+        </w:rPr>
+      </w:pPr>
+      <w:r>
+        <w:rPr>
+          <w:rFonts w:ascii="Biome" w:hAnsi="Biome" w:cs="Biome"/>
+          <w:color w:val="3A3A3A" w:themeColor="background2" w:themeShade="40"/>
+          <w:sz w:val="22"/>
+          <w:szCs w:val="22"/>
+        </w:rPr>
+        <w:t xml:space="preserve">Near black 2: </w:t>
+      </w:r>
+      <w:r>
+        <w:rPr>
+          <w:rFonts w:ascii="Biome" w:hAnsi="Biome" w:cs="Biome"/>
+          <w:color w:val="3A3A3A" w:themeColor="background2" w:themeShade="40"/>
+          <w:sz w:val="22"/>
+          <w:szCs w:val="22"/>
+        </w:rPr>
+        <w:t>#1A1A1A</w:t>
+      </w:r>
+    </w:p>
+    <w:p>
+      <w:pPr>
+        <w:rPr>
+          <w:rFonts w:ascii="Biome" w:hAnsi="Biome" w:cs="Biome"/>
+          <w:color w:val="3A3A3A" w:themeColor="background2" w:themeShade="40"/>
+          <w:sz w:val="22"/>
+          <w:szCs w:val="22"/>
+        </w:rPr>
+      </w:pPr>
+      <w:r>
+        <w:rPr>
+          <w:rFonts w:ascii="Biome" w:hAnsi="Biome" w:cs="Biome"/>
+          <w:color w:val="3A3A3A" w:themeColor="background2" w:themeShade="40"/>
+          <w:sz w:val="22"/>
+          <w:szCs w:val="22"/>
+        </w:rPr>
+        <w:t>Will be the secondary background color.</w:t>
+      </w:r>
+    </w:p>
+    <w:p>
+      <w:pPr>
+        <w:rPr>
+          <w:rFonts w:ascii="Biome" w:hAnsi="Biome" w:cs="Biome"/>
+          <w:color w:val="3A3A3A" w:themeColor="background2" w:themeShade="40"/>
+          <w:sz w:val="22"/>
+          <w:szCs w:val="22"/>
+        </w:rPr>
+      </w:pPr>
+    </w:p>
+    <w:p>
+      <w:pPr>
+        <w:rPr>
+          <w:rFonts w:ascii="Biome" w:hAnsi="Biome" w:cs="Biome"/>
+          <w:color w:val="3A3A3A" w:themeColor="background2" w:themeShade="40"/>
+          <w:sz w:val="22"/>
+          <w:szCs w:val="22"/>
+        </w:rPr>
+      </w:pPr>
+      <w:r>
+        <w:rPr>
+          <w:rFonts w:ascii="Biome" w:hAnsi="Biome" w:cs="Biome"/>
+          <w:color w:val="3A3A3A" w:themeColor="background2" w:themeShade="40"/>
+          <w:sz w:val="22"/>
+          <w:szCs w:val="22"/>
           <w:lang w:val="en-US"/>
         </w:rPr>
-        <w:t>#</w:t>
-      </w:r>
-      <w:proofErr w:type="gramEnd"/>
-      <w:r>
-        <w:rPr>
-          <w:rFonts w:ascii="Biome" w:hAnsi="Biome" w:cs="Biome"/>
-          <w:color w:val="3A3A3A" w:themeColor="background2" w:themeShade="40"/>
+        <w:t xml:space="preserve">White: </w:t>
+      </w:r>
+      <w:r>
+        <w:rPr>
+          <w:rFonts w:ascii="Biome" w:hAnsi="Biome" w:cs="Biome"/>
+          <w:color w:val="3A3A3A" w:themeColor="background2" w:themeShade="40"/>
+          <w:sz w:val="22"/>
+          <w:szCs w:val="22"/>
           <w:lang w:val="en-US"/>
         </w:rPr>
-        <w:t>000000</w:t>
-      </w:r>
-      <w:r>
-        <w:rPr>
-          <w:rFonts w:ascii="Biome" w:hAnsi="Biome" w:cs="Biome"/>
-          <w:color w:val="3A3A3A" w:themeColor="background2" w:themeShade="40"/>
-          <w:lang w:val="en-US"/>
-        </w:rPr>
-        <w:br/>
-      </w:r>
-      <w:r>
-        <w:rPr>
-          <w:rFonts w:ascii="Biome" w:hAnsi="Biome" w:cs="Biome"/>
-          <w:color w:val="1A2B23"/>
-        </w:rPr>
-        <w:t>Will be used for Text.</w:t>
-      </w:r>
-    </w:p>
-    <w:p>
-      <w:pPr>
-        <w:rPr>
-          <w:rFonts w:ascii="Biome" w:hAnsi="Biome" w:cs="Biome"/>
-          <w:color w:val="1A2B23"/>
-        </w:rPr>
-      </w:pPr>
-    </w:p>
-    <w:p>
-      <w:pPr>
-        <w:rPr>
-          <w:rFonts w:ascii="Biome" w:hAnsi="Biome" w:cs="Biome"/>
-          <w:color w:val="3A3A3A" w:themeColor="background2" w:themeShade="40"/>
-        </w:rPr>
-      </w:pPr>
-      <w:r>
-        <w:rPr>
-          <w:rFonts w:ascii="Biome" w:hAnsi="Biome" w:cs="Biome"/>
-          <w:color w:val="1A2B23"/>
-        </w:rPr>
-        <w:t xml:space="preserve">Neon Green: </w:t>
-      </w:r>
-      <w:r>
-        <w:rPr>
-          <w:rFonts w:ascii="Biome" w:hAnsi="Biome" w:cs="Biome"/>
-          <w:color w:val="3A3A3A" w:themeColor="background2" w:themeShade="40"/>
-        </w:rPr>
-        <w:t>#00FF00</w:t>
-      </w:r>
-    </w:p>
-    <w:p>
-      <w:pPr>
-        <w:rPr>
-          <w:rFonts w:ascii="Biome" w:hAnsi="Biome" w:cs="Biome"/>
-          <w:color w:val="3A3A3A" w:themeColor="background2" w:themeShade="40"/>
-        </w:rPr>
-      </w:pPr>
-      <w:r>
-        <w:rPr>
-          <w:rFonts w:ascii="Biome" w:hAnsi="Biome" w:cs="Biome"/>
-          <w:color w:val="3A3A3A" w:themeColor="background2" w:themeShade="40"/>
-        </w:rPr>
-        <w:t>Will be used for the logo, Borders, and buttons</w:t>
-      </w:r>
-    </w:p>
-    <w:p>
-      <w:pPr>
-        <w:rPr>
-          <w:rFonts w:ascii="Biome" w:hAnsi="Biome" w:cs="Biome"/>
-          <w:color w:val="3A3A3A" w:themeColor="background2" w:themeShade="40"/>
-        </w:rPr>
-      </w:pPr>
-      <w:r>
-        <w:rPr>
-          <w:rFonts w:ascii="Biome" w:hAnsi="Biome" w:cs="Biome"/>
-          <w:color w:val="3A3A3A" w:themeColor="background2" w:themeShade="40"/>
-        </w:rPr>
-        <w:t xml:space="preserve"> </w:t>
-      </w:r>
-    </w:p>
-    <w:p>
-      <w:pPr>
-        <w:rPr>
-          <w:rFonts w:ascii="Biome" w:hAnsi="Biome" w:cs="Biome"/>
-          <w:color w:val="3A3A3A" w:themeColor="background2" w:themeShade="40"/>
-          <w:sz w:val="22"/>
-          <w:szCs w:val="22"/>
-        </w:rPr>
-      </w:pPr>
-      <w:r>
-        <w:rPr>
-          <w:rFonts w:ascii="Biome" w:hAnsi="Biome" w:cs="Biome"/>
-          <w:color w:val="3A3A3A" w:themeColor="background2" w:themeShade="40"/>
-        </w:rPr>
-        <w:t xml:space="preserve">Near black: </w:t>
-      </w:r>
-      <w:r>
-        <w:rPr>
-          <w:rFonts w:ascii="Biome" w:hAnsi="Biome" w:cs="Biome"/>
-          <w:color w:val="3A3A3A" w:themeColor="background2" w:themeShade="40"/>
-          <w:sz w:val="22"/>
-          <w:szCs w:val="22"/>
-        </w:rPr>
-        <w:t>#1E2520</w:t>
-      </w:r>
-    </w:p>
-    <w:p>
-      <w:pPr>
-        <w:rPr>
-          <w:rFonts w:ascii="Biome" w:hAnsi="Biome" w:cs="Biome"/>
-          <w:color w:val="3A3A3A" w:themeColor="background2" w:themeShade="40"/>
-          <w:sz w:val="22"/>
-          <w:szCs w:val="22"/>
-        </w:rPr>
-      </w:pPr>
-      <w:r>
-        <w:rPr>
-          <w:rFonts w:ascii="Biome" w:hAnsi="Biome" w:cs="Biome"/>
-          <w:color w:val="3A3A3A" w:themeColor="background2" w:themeShade="40"/>
-          <w:sz w:val="22"/>
-          <w:szCs w:val="22"/>
-        </w:rPr>
-        <w:t>Will be the primary Background color.</w:t>
-      </w:r>
-    </w:p>
-    <w:p>
-      <w:pPr>
-        <w:rPr>
-          <w:rFonts w:ascii="Biome" w:hAnsi="Biome" w:cs="Biome"/>
-          <w:color w:val="3A3A3A" w:themeColor="background2" w:themeShade="40"/>
-          <w:sz w:val="22"/>
-          <w:szCs w:val="22"/>
-        </w:rPr>
-      </w:pPr>
-    </w:p>
-    <w:p>
-      <w:pPr>
-        <w:rPr>
-          <w:rFonts w:ascii="Biome" w:hAnsi="Biome" w:cs="Biome"/>
-          <w:color w:val="3A3A3A" w:themeColor="background2" w:themeShade="40"/>
-          <w:sz w:val="22"/>
-          <w:szCs w:val="22"/>
-        </w:rPr>
-      </w:pPr>
-      <w:r>
-        <w:rPr>
-          <w:rFonts w:ascii="Biome" w:hAnsi="Biome" w:cs="Biome"/>
-          <w:color w:val="3A3A3A" w:themeColor="background2" w:themeShade="40"/>
-          <w:sz w:val="22"/>
-          <w:szCs w:val="22"/>
-        </w:rPr>
-        <w:t xml:space="preserve">Near black 2: </w:t>
-      </w:r>
-      <w:r>
-        <w:rPr>
-          <w:rFonts w:ascii="Biome" w:hAnsi="Biome" w:cs="Biome"/>
-          <w:color w:val="3A3A3A" w:themeColor="background2" w:themeShade="40"/>
-          <w:sz w:val="22"/>
-          <w:szCs w:val="22"/>
-        </w:rPr>
-        <w:t>#1A1A1A</w:t>
-      </w:r>
-    </w:p>
-    <w:p>
-      <w:pPr>
-        <w:rPr>
-          <w:rFonts w:ascii="Biome" w:hAnsi="Biome" w:cs="Biome"/>
-          <w:color w:val="3A3A3A" w:themeColor="background2" w:themeShade="40"/>
-          <w:sz w:val="22"/>
-          <w:szCs w:val="22"/>
-        </w:rPr>
-      </w:pPr>
-      <w:r>
-        <w:rPr>
-          <w:rFonts w:ascii="Biome" w:hAnsi="Biome" w:cs="Biome"/>
-          <w:color w:val="3A3A3A" w:themeColor="background2" w:themeShade="40"/>
-          <w:sz w:val="22"/>
-          <w:szCs w:val="22"/>
-        </w:rPr>
-        <w:t>Will be the secondary background color.</w:t>
-      </w:r>
-    </w:p>
-    <w:p>
-      <w:pPr>
-        <w:rPr>
-          <w:rFonts w:ascii="Biome" w:hAnsi="Biome" w:cs="Biome"/>
-          <w:color w:val="3A3A3A" w:themeColor="background2" w:themeShade="40"/>
-          <w:sz w:val="22"/>
-          <w:szCs w:val="22"/>
-        </w:rPr>
-      </w:pPr>
-    </w:p>
-    <w:p>
-      <w:pPr>
-        <w:rPr>
-          <w:rFonts w:ascii="Biome" w:hAnsi="Biome" w:cs="Biome"/>
-          <w:color w:val="3A3A3A" w:themeColor="background2" w:themeShade="40"/>
-          <w:sz w:val="22"/>
-          <w:szCs w:val="22"/>
-        </w:rPr>
-      </w:pPr>
-      <w:r>
-        <w:rPr>
-          <w:rFonts w:ascii="Biome" w:hAnsi="Biome" w:cs="Biome"/>
-          <w:color w:val="3A3A3A" w:themeColor="background2" w:themeShade="40"/>
-          <w:sz w:val="22"/>
-          <w:szCs w:val="22"/>
-          <w:lang w:val="en-US"/>
-        </w:rPr>
-        <w:t xml:space="preserve">White: </w:t>
-      </w:r>
-      <w:r>
-        <w:rPr>
-          <w:rFonts w:ascii="Biome" w:hAnsi="Biome" w:cs="Biome"/>
-          <w:color w:val="3A3A3A" w:themeColor="background2" w:themeShade="40"/>
-          <w:sz w:val="22"/>
-          <w:szCs w:val="22"/>
-          <w:lang w:val="en-US"/>
-        </w:rPr>
         <w:t>#FFFFFF</w:t>
       </w:r>
     </w:p>
@@ -1188,6 +1178,46 @@
           <w:szCs w:val="22"/>
         </w:rPr>
       </w:pPr>
+    </w:p>
+    <w:p>
+      <w:pPr>
+        <w:rPr>
+          <w:rFonts w:ascii="Biome" w:hAnsi="Biome" w:cs="Biome"/>
+          <w:color w:val="3A3A3A" w:themeColor="background2" w:themeShade="40"/>
+          <w:sz w:val="22"/>
+          <w:szCs w:val="22"/>
+        </w:rPr>
+      </w:pPr>
+      <w:r>
+        <w:rPr>
+          <w:rFonts w:ascii="Biome" w:hAnsi="Biome" w:cs="Biome"/>
+          <w:color w:val="3A3A3A" w:themeColor="background2" w:themeShade="40"/>
+          <w:sz w:val="22"/>
+          <w:szCs w:val="22"/>
+        </w:rPr>
+        <w:t>Primary Background color:</w:t>
+      </w:r>
+    </w:p>
+    <w:p>
+      <w:pPr>
+        <w:rPr>
+          <w:rFonts w:ascii="Biome" w:hAnsi="Biome" w:cs="Biome"/>
+          <w:color w:val="3A3A3A" w:themeColor="background2" w:themeShade="40"/>
+          <w:sz w:val="22"/>
+          <w:szCs w:val="22"/>
+          <w:lang w:val="en-NL"/>
+        </w:rPr>
+      </w:pPr>
+      <w:r>
+        <w:rPr>
+          <w:rFonts w:ascii="Biome" w:hAnsi="Biome" w:cs="Biome"/>
+          <w:color w:val="3A3A3A" w:themeColor="background2" w:themeShade="40"/>
+          <w:sz w:val="22"/>
+          <w:szCs w:val="22"/>
+          <w:lang w:val="en-NL"/>
+        </w:rPr>
+        <w:t>#0f1410</w:t>
+      </w:r>
     </w:p>
     <w:p>
       <w:pPr>

</xml_diff>